<commit_message>
Update Assignment 2 Screenshots.pdf
</commit_message>
<xml_diff>
--- a/screenshots/Assignment 2 Screenshots.docx
+++ b/screenshots/Assignment 2 Screenshots.docx
@@ -149,6 +149,7 @@
       </w:pPr>
       <w:r>
         <w:rPr>
+          <w:noProof/>
           <w:sz w:val="32"/>
           <w:szCs w:val="32"/>
         </w:rPr>
@@ -209,6 +210,7 @@
       </w:pPr>
       <w:r>
         <w:rPr>
+          <w:noProof/>
           <w:sz w:val="32"/>
           <w:szCs w:val="32"/>
         </w:rPr>
@@ -269,6 +271,7 @@
       </w:pPr>
       <w:r>
         <w:rPr>
+          <w:noProof/>
           <w:sz w:val="32"/>
           <w:szCs w:val="32"/>
         </w:rPr>
@@ -329,6 +332,7 @@
       </w:pPr>
       <w:r>
         <w:rPr>
+          <w:noProof/>
           <w:sz w:val="32"/>
           <w:szCs w:val="32"/>
         </w:rPr>
@@ -380,6 +384,7 @@
       </w:pPr>
       <w:r>
         <w:rPr>
+          <w:noProof/>
           <w:sz w:val="32"/>
           <w:szCs w:val="32"/>
         </w:rPr>
@@ -524,6 +529,7 @@
       </w:pPr>
       <w:r>
         <w:rPr>
+          <w:noProof/>
           <w:sz w:val="32"/>
           <w:szCs w:val="32"/>
         </w:rPr>
@@ -575,6 +581,7 @@
       </w:pPr>
       <w:r>
         <w:rPr>
+          <w:noProof/>
           <w:sz w:val="32"/>
           <w:szCs w:val="32"/>
         </w:rPr>
@@ -626,6 +633,7 @@
       </w:pPr>
       <w:r>
         <w:rPr>
+          <w:noProof/>
           <w:sz w:val="32"/>
           <w:szCs w:val="32"/>
         </w:rPr>
@@ -677,6 +685,7 @@
       </w:pPr>
       <w:r>
         <w:rPr>
+          <w:noProof/>
           <w:sz w:val="32"/>
           <w:szCs w:val="32"/>
         </w:rPr>
@@ -728,6 +737,7 @@
       </w:pPr>
       <w:r>
         <w:rPr>
+          <w:noProof/>
           <w:sz w:val="32"/>
           <w:szCs w:val="32"/>
         </w:rPr>
@@ -801,6 +811,7 @@
       </w:pPr>
       <w:r>
         <w:rPr>
+          <w:noProof/>
           <w:sz w:val="32"/>
           <w:szCs w:val="32"/>
         </w:rPr>
@@ -852,6 +863,7 @@
       </w:pPr>
       <w:r>
         <w:rPr>
+          <w:noProof/>
           <w:sz w:val="32"/>
           <w:szCs w:val="32"/>
         </w:rPr>
@@ -926,6 +938,7 @@
       </w:pPr>
       <w:r>
         <w:rPr>
+          <w:noProof/>
           <w:sz w:val="32"/>
           <w:szCs w:val="32"/>
         </w:rPr>
@@ -977,6 +990,7 @@
       </w:pPr>
       <w:r>
         <w:rPr>
+          <w:noProof/>
           <w:sz w:val="32"/>
           <w:szCs w:val="32"/>
         </w:rPr>
@@ -1050,6 +1064,7 @@
       </w:pPr>
       <w:r>
         <w:rPr>
+          <w:noProof/>
           <w:sz w:val="32"/>
           <w:szCs w:val="32"/>
         </w:rPr>
@@ -1101,6 +1116,7 @@
       </w:pPr>
       <w:r>
         <w:rPr>
+          <w:noProof/>
           <w:sz w:val="32"/>
           <w:szCs w:val="32"/>
         </w:rPr>
@@ -1175,6 +1191,7 @@
       </w:pPr>
       <w:r>
         <w:rPr>
+          <w:noProof/>
           <w:sz w:val="32"/>
           <w:szCs w:val="32"/>
         </w:rPr>
@@ -1226,6 +1243,7 @@
       </w:pPr>
       <w:r>
         <w:rPr>
+          <w:noProof/>
           <w:sz w:val="32"/>
           <w:szCs w:val="32"/>
         </w:rPr>
@@ -1299,6 +1317,7 @@
       </w:pPr>
       <w:r>
         <w:rPr>
+          <w:noProof/>
           <w:sz w:val="32"/>
           <w:szCs w:val="32"/>
         </w:rPr>
@@ -1350,6 +1369,7 @@
       </w:pPr>
       <w:r>
         <w:rPr>
+          <w:noProof/>
           <w:sz w:val="32"/>
           <w:szCs w:val="32"/>
         </w:rPr>
@@ -1402,6 +1422,7 @@
       </w:pPr>
       <w:r>
         <w:rPr>
+          <w:noProof/>
           <w:sz w:val="32"/>
           <w:szCs w:val="32"/>
         </w:rPr>
@@ -1453,6 +1474,7 @@
       </w:pPr>
       <w:r>
         <w:rPr>
+          <w:noProof/>
           <w:sz w:val="32"/>
           <w:szCs w:val="32"/>
         </w:rPr>
@@ -1526,6 +1548,7 @@
       </w:pPr>
       <w:r>
         <w:rPr>
+          <w:noProof/>
           <w:sz w:val="32"/>
           <w:szCs w:val="32"/>
         </w:rPr>
@@ -1569,6 +1592,66 @@
     <w:p>
       <w:pPr>
         <w:pStyle w:val="ListParagraph"/>
+        <w:ind w:left="357"/>
+        <w:rPr>
+          <w:sz w:val="32"/>
+          <w:szCs w:val="32"/>
+        </w:rPr>
+      </w:pPr>
+    </w:p>
+    <w:p>
+      <w:pPr>
+        <w:pStyle w:val="ListParagraph"/>
+        <w:ind w:left="357"/>
+        <w:rPr>
+          <w:sz w:val="32"/>
+          <w:szCs w:val="32"/>
+        </w:rPr>
+      </w:pPr>
+    </w:p>
+    <w:p>
+      <w:pPr>
+        <w:pStyle w:val="ListParagraph"/>
+        <w:ind w:left="357"/>
+        <w:rPr>
+          <w:sz w:val="32"/>
+          <w:szCs w:val="32"/>
+        </w:rPr>
+      </w:pPr>
+    </w:p>
+    <w:p>
+      <w:pPr>
+        <w:pStyle w:val="ListParagraph"/>
+        <w:ind w:left="357"/>
+        <w:rPr>
+          <w:sz w:val="32"/>
+          <w:szCs w:val="32"/>
+        </w:rPr>
+      </w:pPr>
+    </w:p>
+    <w:p>
+      <w:pPr>
+        <w:pStyle w:val="ListParagraph"/>
+        <w:ind w:left="357"/>
+        <w:rPr>
+          <w:sz w:val="32"/>
+          <w:szCs w:val="32"/>
+        </w:rPr>
+      </w:pPr>
+    </w:p>
+    <w:p>
+      <w:pPr>
+        <w:pStyle w:val="ListParagraph"/>
+        <w:ind w:left="357"/>
+        <w:rPr>
+          <w:sz w:val="32"/>
+          <w:szCs w:val="32"/>
+        </w:rPr>
+      </w:pPr>
+    </w:p>
+    <w:p>
+      <w:pPr>
+        <w:pStyle w:val="ListParagraph"/>
         <w:numPr>
           <w:ilvl w:val="0"/>
           <w:numId w:val="2"/>
@@ -1585,6 +1668,7 @@
           <w:sz w:val="32"/>
           <w:szCs w:val="32"/>
         </w:rPr>
+        <w:lastRenderedPageBreak/>
         <w:t>Memory Recall</w:t>
       </w:r>
     </w:p>
@@ -1599,10 +1683,10 @@
       </w:pPr>
       <w:r>
         <w:rPr>
-          <w:sz w:val="32"/>
-          <w:szCs w:val="32"/>
-        </w:rPr>
-        <w:lastRenderedPageBreak/>
+          <w:noProof/>
+          <w:sz w:val="32"/>
+          <w:szCs w:val="32"/>
+        </w:rPr>
         <w:drawing>
           <wp:inline distT="0" distB="0" distL="0" distR="0" wp14:anchorId="2CC69BA9" wp14:editId="164AF28C">
             <wp:extent cx="5943600" cy="2539365"/>
@@ -1651,6 +1735,7 @@
       </w:pPr>
       <w:r>
         <w:rPr>
+          <w:noProof/>
           <w:sz w:val="32"/>
           <w:szCs w:val="32"/>
         </w:rPr>
@@ -1724,6 +1809,7 @@
       </w:pPr>
       <w:r>
         <w:rPr>
+          <w:noProof/>
           <w:sz w:val="32"/>
           <w:szCs w:val="32"/>
         </w:rPr>
@@ -1775,6 +1861,7 @@
       </w:pPr>
       <w:r>
         <w:rPr>
+          <w:noProof/>
           <w:sz w:val="32"/>
           <w:szCs w:val="32"/>
         </w:rPr>
@@ -1826,6 +1913,7 @@
       </w:pPr>
       <w:r>
         <w:rPr>
+          <w:noProof/>
           <w:sz w:val="32"/>
           <w:szCs w:val="32"/>
         </w:rPr>
@@ -1877,6 +1965,7 @@
       </w:pPr>
       <w:r>
         <w:rPr>
+          <w:noProof/>
           <w:sz w:val="32"/>
           <w:szCs w:val="32"/>
         </w:rPr>
@@ -1940,16 +2029,6 @@
     <w:p>
       <w:pPr>
         <w:pStyle w:val="ListParagraph"/>
-        <w:ind w:left="357"/>
-        <w:rPr>
-          <w:sz w:val="32"/>
-          <w:szCs w:val="32"/>
-        </w:rPr>
-      </w:pPr>
-    </w:p>
-    <w:p>
-      <w:pPr>
-        <w:pStyle w:val="ListParagraph"/>
         <w:numPr>
           <w:ilvl w:val="0"/>
           <w:numId w:val="2"/>
@@ -1981,6 +2060,7 @@
       </w:pPr>
       <w:r>
         <w:rPr>
+          <w:noProof/>
           <w:sz w:val="32"/>
           <w:szCs w:val="32"/>
         </w:rPr>
@@ -2054,11 +2134,12 @@
       </w:pPr>
       <w:r>
         <w:rPr>
+          <w:noProof/>
           <w:sz w:val="32"/>
           <w:szCs w:val="32"/>
         </w:rPr>
         <w:drawing>
-          <wp:inline distT="0" distB="0" distL="0" distR="0" wp14:anchorId="28D87FE1" wp14:editId="14AEB302">
+          <wp:inline distT="0" distB="0" distL="0" distR="0" wp14:anchorId="5513255C" wp14:editId="5A8D2BC9">
             <wp:extent cx="1455546" cy="853514"/>
             <wp:effectExtent l="0" t="0" r="0" b="3810"/>
             <wp:docPr id="2103618919" name="Picture 1"/>
@@ -2097,7 +2178,448 @@
     <w:p>
       <w:pPr>
         <w:pStyle w:val="ListParagraph"/>
-        <w:ind w:left="357"/>
+        <w:numPr>
+          <w:ilvl w:val="0"/>
+          <w:numId w:val="2"/>
+        </w:numPr>
+        <w:rPr>
+          <w:sz w:val="32"/>
+          <w:szCs w:val="32"/>
+        </w:rPr>
+      </w:pPr>
+      <w:r>
+        <w:rPr>
+          <w:b/>
+          <w:bCs/>
+          <w:sz w:val="32"/>
+          <w:szCs w:val="32"/>
+        </w:rPr>
+        <w:t>Final Response Generation</w:t>
+      </w:r>
+    </w:p>
+    <w:p>
+      <w:pPr>
+        <w:pStyle w:val="ListParagraph"/>
+        <w:ind w:left="357"/>
+        <w:rPr>
+          <w:sz w:val="32"/>
+          <w:szCs w:val="32"/>
+        </w:rPr>
+      </w:pPr>
+      <w:r>
+        <w:rPr>
+          <w:sz w:val="32"/>
+          <w:szCs w:val="32"/>
+        </w:rPr>
+        <w:drawing>
+          <wp:inline distT="0" distB="0" distL="0" distR="0" wp14:anchorId="64DD1B3D" wp14:editId="6802F9F5">
+            <wp:extent cx="5943600" cy="2661920"/>
+            <wp:effectExtent l="0" t="0" r="0" b="5080"/>
+            <wp:docPr id="391676926" name="Picture 1"/>
+            <wp:cNvGraphicFramePr>
+              <a:graphicFrameLocks xmlns:a="http://schemas.openxmlformats.org/drawingml/2006/main" noChangeAspect="1"/>
+            </wp:cNvGraphicFramePr>
+            <a:graphic xmlns:a="http://schemas.openxmlformats.org/drawingml/2006/main">
+              <a:graphicData uri="http://schemas.openxmlformats.org/drawingml/2006/picture">
+                <pic:pic xmlns:pic="http://schemas.openxmlformats.org/drawingml/2006/picture">
+                  <pic:nvPicPr>
+                    <pic:cNvPr id="391676926" name=""/>
+                    <pic:cNvPicPr/>
+                  </pic:nvPicPr>
+                  <pic:blipFill>
+                    <a:blip r:embed="rId38"/>
+                    <a:stretch>
+                      <a:fillRect/>
+                    </a:stretch>
+                  </pic:blipFill>
+                  <pic:spPr>
+                    <a:xfrm>
+                      <a:off x="0" y="0"/>
+                      <a:ext cx="5943600" cy="2661920"/>
+                    </a:xfrm>
+                    <a:prstGeom prst="rect">
+                      <a:avLst/>
+                    </a:prstGeom>
+                  </pic:spPr>
+                </pic:pic>
+              </a:graphicData>
+            </a:graphic>
+          </wp:inline>
+        </w:drawing>
+      </w:r>
+    </w:p>
+    <w:p>
+      <w:pPr>
+        <w:pStyle w:val="ListParagraph"/>
+        <w:ind w:left="357"/>
+        <w:rPr>
+          <w:sz w:val="32"/>
+          <w:szCs w:val="32"/>
+        </w:rPr>
+      </w:pPr>
+      <w:r>
+        <w:rPr>
+          <w:sz w:val="32"/>
+          <w:szCs w:val="32"/>
+        </w:rPr>
+        <w:drawing>
+          <wp:inline distT="0" distB="0" distL="0" distR="0" wp14:anchorId="372935D8" wp14:editId="3886018F">
+            <wp:extent cx="5943600" cy="2690495"/>
+            <wp:effectExtent l="0" t="0" r="0" b="0"/>
+            <wp:docPr id="1360560695" name="Picture 1"/>
+            <wp:cNvGraphicFramePr>
+              <a:graphicFrameLocks xmlns:a="http://schemas.openxmlformats.org/drawingml/2006/main" noChangeAspect="1"/>
+            </wp:cNvGraphicFramePr>
+            <a:graphic xmlns:a="http://schemas.openxmlformats.org/drawingml/2006/main">
+              <a:graphicData uri="http://schemas.openxmlformats.org/drawingml/2006/picture">
+                <pic:pic xmlns:pic="http://schemas.openxmlformats.org/drawingml/2006/picture">
+                  <pic:nvPicPr>
+                    <pic:cNvPr id="1360560695" name=""/>
+                    <pic:cNvPicPr/>
+                  </pic:nvPicPr>
+                  <pic:blipFill>
+                    <a:blip r:embed="rId39"/>
+                    <a:stretch>
+                      <a:fillRect/>
+                    </a:stretch>
+                  </pic:blipFill>
+                  <pic:spPr>
+                    <a:xfrm>
+                      <a:off x="0" y="0"/>
+                      <a:ext cx="5943600" cy="2690495"/>
+                    </a:xfrm>
+                    <a:prstGeom prst="rect">
+                      <a:avLst/>
+                    </a:prstGeom>
+                  </pic:spPr>
+                </pic:pic>
+              </a:graphicData>
+            </a:graphic>
+          </wp:inline>
+        </w:drawing>
+      </w:r>
+    </w:p>
+    <w:p>
+      <w:pPr>
+        <w:pStyle w:val="ListParagraph"/>
+        <w:ind w:left="357"/>
+        <w:rPr>
+          <w:sz w:val="32"/>
+          <w:szCs w:val="32"/>
+        </w:rPr>
+      </w:pPr>
+      <w:r>
+        <w:rPr>
+          <w:sz w:val="32"/>
+          <w:szCs w:val="32"/>
+        </w:rPr>
+        <w:lastRenderedPageBreak/>
+        <w:drawing>
+          <wp:inline distT="0" distB="0" distL="0" distR="0" wp14:anchorId="2850E53C" wp14:editId="5866F881">
+            <wp:extent cx="5943600" cy="2975610"/>
+            <wp:effectExtent l="0" t="0" r="0" b="0"/>
+            <wp:docPr id="672988141" name="Picture 1"/>
+            <wp:cNvGraphicFramePr>
+              <a:graphicFrameLocks xmlns:a="http://schemas.openxmlformats.org/drawingml/2006/main" noChangeAspect="1"/>
+            </wp:cNvGraphicFramePr>
+            <a:graphic xmlns:a="http://schemas.openxmlformats.org/drawingml/2006/main">
+              <a:graphicData uri="http://schemas.openxmlformats.org/drawingml/2006/picture">
+                <pic:pic xmlns:pic="http://schemas.openxmlformats.org/drawingml/2006/picture">
+                  <pic:nvPicPr>
+                    <pic:cNvPr id="672988141" name=""/>
+                    <pic:cNvPicPr/>
+                  </pic:nvPicPr>
+                  <pic:blipFill>
+                    <a:blip r:embed="rId40"/>
+                    <a:stretch>
+                      <a:fillRect/>
+                    </a:stretch>
+                  </pic:blipFill>
+                  <pic:spPr>
+                    <a:xfrm>
+                      <a:off x="0" y="0"/>
+                      <a:ext cx="5943600" cy="2975610"/>
+                    </a:xfrm>
+                    <a:prstGeom prst="rect">
+                      <a:avLst/>
+                    </a:prstGeom>
+                  </pic:spPr>
+                </pic:pic>
+              </a:graphicData>
+            </a:graphic>
+          </wp:inline>
+        </w:drawing>
+      </w:r>
+    </w:p>
+    <w:p>
+      <w:pPr>
+        <w:pStyle w:val="ListParagraph"/>
+        <w:ind w:left="357"/>
+        <w:rPr>
+          <w:sz w:val="32"/>
+          <w:szCs w:val="32"/>
+        </w:rPr>
+      </w:pPr>
+      <w:r>
+        <w:rPr>
+          <w:sz w:val="32"/>
+          <w:szCs w:val="32"/>
+        </w:rPr>
+        <w:drawing>
+          <wp:inline distT="0" distB="0" distL="0" distR="0" wp14:anchorId="7E8ECBED" wp14:editId="1F7B19AA">
+            <wp:extent cx="5943600" cy="2388870"/>
+            <wp:effectExtent l="0" t="0" r="0" b="0"/>
+            <wp:docPr id="1435365647" name="Picture 1"/>
+            <wp:cNvGraphicFramePr>
+              <a:graphicFrameLocks xmlns:a="http://schemas.openxmlformats.org/drawingml/2006/main" noChangeAspect="1"/>
+            </wp:cNvGraphicFramePr>
+            <a:graphic xmlns:a="http://schemas.openxmlformats.org/drawingml/2006/main">
+              <a:graphicData uri="http://schemas.openxmlformats.org/drawingml/2006/picture">
+                <pic:pic xmlns:pic="http://schemas.openxmlformats.org/drawingml/2006/picture">
+                  <pic:nvPicPr>
+                    <pic:cNvPr id="1435365647" name=""/>
+                    <pic:cNvPicPr/>
+                  </pic:nvPicPr>
+                  <pic:blipFill>
+                    <a:blip r:embed="rId41"/>
+                    <a:stretch>
+                      <a:fillRect/>
+                    </a:stretch>
+                  </pic:blipFill>
+                  <pic:spPr>
+                    <a:xfrm>
+                      <a:off x="0" y="0"/>
+                      <a:ext cx="5943600" cy="2388870"/>
+                    </a:xfrm>
+                    <a:prstGeom prst="rect">
+                      <a:avLst/>
+                    </a:prstGeom>
+                  </pic:spPr>
+                </pic:pic>
+              </a:graphicData>
+            </a:graphic>
+          </wp:inline>
+        </w:drawing>
+      </w:r>
+    </w:p>
+    <w:p>
+      <w:pPr>
+        <w:pStyle w:val="ListParagraph"/>
+        <w:ind w:left="357"/>
+        <w:rPr>
+          <w:sz w:val="32"/>
+          <w:szCs w:val="32"/>
+        </w:rPr>
+      </w:pPr>
+      <w:r>
+        <w:rPr>
+          <w:sz w:val="32"/>
+          <w:szCs w:val="32"/>
+        </w:rPr>
+        <w:lastRenderedPageBreak/>
+        <w:drawing>
+          <wp:inline distT="0" distB="0" distL="0" distR="0" wp14:anchorId="77B6962B" wp14:editId="78AE5269">
+            <wp:extent cx="5943600" cy="2807970"/>
+            <wp:effectExtent l="0" t="0" r="0" b="0"/>
+            <wp:docPr id="429199297" name="Picture 1"/>
+            <wp:cNvGraphicFramePr>
+              <a:graphicFrameLocks xmlns:a="http://schemas.openxmlformats.org/drawingml/2006/main" noChangeAspect="1"/>
+            </wp:cNvGraphicFramePr>
+            <a:graphic xmlns:a="http://schemas.openxmlformats.org/drawingml/2006/main">
+              <a:graphicData uri="http://schemas.openxmlformats.org/drawingml/2006/picture">
+                <pic:pic xmlns:pic="http://schemas.openxmlformats.org/drawingml/2006/picture">
+                  <pic:nvPicPr>
+                    <pic:cNvPr id="429199297" name=""/>
+                    <pic:cNvPicPr/>
+                  </pic:nvPicPr>
+                  <pic:blipFill>
+                    <a:blip r:embed="rId42"/>
+                    <a:stretch>
+                      <a:fillRect/>
+                    </a:stretch>
+                  </pic:blipFill>
+                  <pic:spPr>
+                    <a:xfrm>
+                      <a:off x="0" y="0"/>
+                      <a:ext cx="5943600" cy="2807970"/>
+                    </a:xfrm>
+                    <a:prstGeom prst="rect">
+                      <a:avLst/>
+                    </a:prstGeom>
+                  </pic:spPr>
+                </pic:pic>
+              </a:graphicData>
+            </a:graphic>
+          </wp:inline>
+        </w:drawing>
+      </w:r>
+    </w:p>
+    <w:p>
+      <w:pPr>
+        <w:pStyle w:val="ListParagraph"/>
+        <w:ind w:left="357"/>
+        <w:rPr>
+          <w:sz w:val="32"/>
+          <w:szCs w:val="32"/>
+        </w:rPr>
+      </w:pPr>
+      <w:r>
+        <w:rPr>
+          <w:sz w:val="32"/>
+          <w:szCs w:val="32"/>
+        </w:rPr>
+        <w:drawing>
+          <wp:inline distT="0" distB="0" distL="0" distR="0" wp14:anchorId="6ECE18C1" wp14:editId="123B4ACC">
+            <wp:extent cx="5943600" cy="3143250"/>
+            <wp:effectExtent l="0" t="0" r="0" b="0"/>
+            <wp:docPr id="1624071507" name="Picture 1"/>
+            <wp:cNvGraphicFramePr>
+              <a:graphicFrameLocks xmlns:a="http://schemas.openxmlformats.org/drawingml/2006/main" noChangeAspect="1"/>
+            </wp:cNvGraphicFramePr>
+            <a:graphic xmlns:a="http://schemas.openxmlformats.org/drawingml/2006/main">
+              <a:graphicData uri="http://schemas.openxmlformats.org/drawingml/2006/picture">
+                <pic:pic xmlns:pic="http://schemas.openxmlformats.org/drawingml/2006/picture">
+                  <pic:nvPicPr>
+                    <pic:cNvPr id="1624071507" name=""/>
+                    <pic:cNvPicPr/>
+                  </pic:nvPicPr>
+                  <pic:blipFill>
+                    <a:blip r:embed="rId43"/>
+                    <a:stretch>
+                      <a:fillRect/>
+                    </a:stretch>
+                  </pic:blipFill>
+                  <pic:spPr>
+                    <a:xfrm>
+                      <a:off x="0" y="0"/>
+                      <a:ext cx="5943600" cy="3143250"/>
+                    </a:xfrm>
+                    <a:prstGeom prst="rect">
+                      <a:avLst/>
+                    </a:prstGeom>
+                  </pic:spPr>
+                </pic:pic>
+              </a:graphicData>
+            </a:graphic>
+          </wp:inline>
+        </w:drawing>
+      </w:r>
+    </w:p>
+    <w:p>
+      <w:pPr>
+        <w:pStyle w:val="ListParagraph"/>
+        <w:ind w:left="357"/>
+        <w:rPr>
+          <w:sz w:val="32"/>
+          <w:szCs w:val="32"/>
+        </w:rPr>
+      </w:pPr>
+      <w:r>
+        <w:rPr>
+          <w:sz w:val="32"/>
+          <w:szCs w:val="32"/>
+        </w:rPr>
+        <w:lastRenderedPageBreak/>
+        <w:drawing>
+          <wp:inline distT="0" distB="0" distL="0" distR="0" wp14:anchorId="360F9E2D" wp14:editId="444EC1ED">
+            <wp:extent cx="5943600" cy="3096260"/>
+            <wp:effectExtent l="0" t="0" r="0" b="8890"/>
+            <wp:docPr id="200973849" name="Picture 1"/>
+            <wp:cNvGraphicFramePr>
+              <a:graphicFrameLocks xmlns:a="http://schemas.openxmlformats.org/drawingml/2006/main" noChangeAspect="1"/>
+            </wp:cNvGraphicFramePr>
+            <a:graphic xmlns:a="http://schemas.openxmlformats.org/drawingml/2006/main">
+              <a:graphicData uri="http://schemas.openxmlformats.org/drawingml/2006/picture">
+                <pic:pic xmlns:pic="http://schemas.openxmlformats.org/drawingml/2006/picture">
+                  <pic:nvPicPr>
+                    <pic:cNvPr id="200973849" name=""/>
+                    <pic:cNvPicPr/>
+                  </pic:nvPicPr>
+                  <pic:blipFill>
+                    <a:blip r:embed="rId44"/>
+                    <a:stretch>
+                      <a:fillRect/>
+                    </a:stretch>
+                  </pic:blipFill>
+                  <pic:spPr>
+                    <a:xfrm>
+                      <a:off x="0" y="0"/>
+                      <a:ext cx="5943600" cy="3096260"/>
+                    </a:xfrm>
+                    <a:prstGeom prst="rect">
+                      <a:avLst/>
+                    </a:prstGeom>
+                  </pic:spPr>
+                </pic:pic>
+              </a:graphicData>
+            </a:graphic>
+          </wp:inline>
+        </w:drawing>
+      </w:r>
+    </w:p>
+    <w:p>
+      <w:pPr>
+        <w:pStyle w:val="ListParagraph"/>
+        <w:ind w:left="357"/>
+        <w:rPr>
+          <w:sz w:val="32"/>
+          <w:szCs w:val="32"/>
+        </w:rPr>
+      </w:pPr>
+      <w:r>
+        <w:rPr>
+          <w:sz w:val="32"/>
+          <w:szCs w:val="32"/>
+        </w:rPr>
+        <w:drawing>
+          <wp:inline distT="0" distB="0" distL="0" distR="0" wp14:anchorId="19F4ACF2" wp14:editId="1EBDE0FB">
+            <wp:extent cx="5943600" cy="1549400"/>
+            <wp:effectExtent l="0" t="0" r="0" b="0"/>
+            <wp:docPr id="1481163659" name="Picture 1"/>
+            <wp:cNvGraphicFramePr>
+              <a:graphicFrameLocks xmlns:a="http://schemas.openxmlformats.org/drawingml/2006/main" noChangeAspect="1"/>
+            </wp:cNvGraphicFramePr>
+            <a:graphic xmlns:a="http://schemas.openxmlformats.org/drawingml/2006/main">
+              <a:graphicData uri="http://schemas.openxmlformats.org/drawingml/2006/picture">
+                <pic:pic xmlns:pic="http://schemas.openxmlformats.org/drawingml/2006/picture">
+                  <pic:nvPicPr>
+                    <pic:cNvPr id="1481163659" name=""/>
+                    <pic:cNvPicPr/>
+                  </pic:nvPicPr>
+                  <pic:blipFill>
+                    <a:blip r:embed="rId45"/>
+                    <a:stretch>
+                      <a:fillRect/>
+                    </a:stretch>
+                  </pic:blipFill>
+                  <pic:spPr>
+                    <a:xfrm>
+                      <a:off x="0" y="0"/>
+                      <a:ext cx="5943600" cy="1549400"/>
+                    </a:xfrm>
+                    <a:prstGeom prst="rect">
+                      <a:avLst/>
+                    </a:prstGeom>
+                  </pic:spPr>
+                </pic:pic>
+              </a:graphicData>
+            </a:graphic>
+          </wp:inline>
+        </w:drawing>
+      </w:r>
+    </w:p>
+    <w:p>
+      <w:pPr>
+        <w:pStyle w:val="ListParagraph"/>
+        <w:ind w:left="357"/>
+        <w:rPr>
+          <w:sz w:val="32"/>
+          <w:szCs w:val="32"/>
+        </w:rPr>
+      </w:pPr>
+    </w:p>
+    <w:p>
+      <w:pPr>
         <w:rPr>
           <w:sz w:val="32"/>
           <w:szCs w:val="32"/>
@@ -2117,6 +2639,92 @@
 <file path=word/numbering.xml><?xml version="1.0" encoding="utf-8"?>
 <w:numbering xmlns:wpc="http://schemas.microsoft.com/office/word/2010/wordprocessingCanvas" xmlns:cx="http://schemas.microsoft.com/office/drawing/2014/chartex" xmlns:cx1="http://schemas.microsoft.com/office/drawing/2015/9/8/chartex" xmlns:cx2="http://schemas.microsoft.com/office/drawing/2015/10/21/chartex" xmlns:cx3="http://schemas.microsoft.com/office/drawing/2016/5/9/chartex" xmlns:cx4="http://schemas.microsoft.com/office/drawing/2016/5/10/chartex" xmlns:cx5="http://schemas.microsoft.com/office/drawing/2016/5/11/chartex" xmlns:cx6="http://schemas.microsoft.com/office/drawing/2016/5/12/chartex" xmlns:cx7="http://schemas.microsoft.com/office/drawing/2016/5/13/chartex" xmlns:cx8="http://schemas.microsoft.com/office/drawing/2016/5/14/chartex" xmlns:mc="http://schemas.openxmlformats.org/markup-compatibility/2006" xmlns:aink="http://schemas.microsoft.com/office/drawing/2016/ink" xmlns:am3d="http://schemas.microsoft.com/office/drawing/2017/model3d" xmlns:o="urn:schemas-microsoft-com:office:office" xmlns:oel="http://schemas.microsoft.com/office/2019/extlst" xmlns:r="http://schemas.openxmlformats.org/officeDocument/2006/relationships" xmlns:m="http://schemas.openxmlformats.org/officeDocument/2006/math" xmlns:v="urn:schemas-microsoft-com:vml" xmlns:wp14="http://schemas.microsoft.com/office/word/2010/wordprocessingDrawing" xmlns:wp="http://schemas.openxmlformats.org/drawingml/2006/wordprocessingDrawing" xmlns:w10="urn:schemas-microsoft-com:office:word" xmlns:w="http://schemas.openxmlformats.org/wordprocessingml/2006/main" xmlns:w14="http://schemas.microsoft.com/office/word/2010/wordml" xmlns:w15="http://schemas.microsoft.com/office/word/2012/wordml" xmlns:w16cex="http://schemas.microsoft.com/office/word/2018/wordml/cex" xmlns:w16cid="http://schemas.microsoft.com/office/word/2016/wordml/cid" xmlns:w16="http://schemas.microsoft.com/office/word/2018/wordml" xmlns:w16du="http://schemas.microsoft.com/office/word/2023/wordml/word16du" xmlns:w16sdtdh="http://schemas.microsoft.com/office/word/2020/wordml/sdtdatahash" xmlns:w16sdtfl="http://schemas.microsoft.com/office/word/2024/wordml/sdtformatlock" xmlns:w16se="http://schemas.microsoft.com/office/word/2015/wordml/symex" xmlns:wpg="http://schemas.microsoft.com/office/word/2010/wordprocessingGroup" xmlns:wpi="http://schemas.microsoft.com/office/word/2010/wordprocessingInk" xmlns:wne="http://schemas.microsoft.com/office/word/2006/wordml" xmlns:wps="http://schemas.microsoft.com/office/word/2010/wordprocessingShape" mc:Ignorable="w14 w15 w16se w16cid w16 w16cex w16sdtdh w16sdtfl w16du wp14">
   <w:abstractNum w:abstractNumId="0" w15:restartNumberingAfterBreak="0">
+    <w:nsid w:val="0CC8172B"/>
+    <w:multiLevelType w:val="hybridMultilevel"/>
+    <w:tmpl w:val="F6282152"/>
+    <w:lvl w:ilvl="0" w:tplc="0409000F">
+      <w:start w:val="1"/>
+      <w:numFmt w:val="decimal"/>
+      <w:lvlText w:val="%1."/>
+      <w:lvlJc w:val="left"/>
+      <w:pPr>
+        <w:ind w:left="1077" w:hanging="360"/>
+      </w:pPr>
+    </w:lvl>
+    <w:lvl w:ilvl="1" w:tplc="04090019" w:tentative="1">
+      <w:start w:val="1"/>
+      <w:numFmt w:val="lowerLetter"/>
+      <w:lvlText w:val="%2."/>
+      <w:lvlJc w:val="left"/>
+      <w:pPr>
+        <w:ind w:left="1797" w:hanging="360"/>
+      </w:pPr>
+    </w:lvl>
+    <w:lvl w:ilvl="2" w:tplc="0409001B" w:tentative="1">
+      <w:start w:val="1"/>
+      <w:numFmt w:val="lowerRoman"/>
+      <w:lvlText w:val="%3."/>
+      <w:lvlJc w:val="right"/>
+      <w:pPr>
+        <w:ind w:left="2517" w:hanging="180"/>
+      </w:pPr>
+    </w:lvl>
+    <w:lvl w:ilvl="3" w:tplc="0409000F" w:tentative="1">
+      <w:start w:val="1"/>
+      <w:numFmt w:val="decimal"/>
+      <w:lvlText w:val="%4."/>
+      <w:lvlJc w:val="left"/>
+      <w:pPr>
+        <w:ind w:left="3237" w:hanging="360"/>
+      </w:pPr>
+    </w:lvl>
+    <w:lvl w:ilvl="4" w:tplc="04090019" w:tentative="1">
+      <w:start w:val="1"/>
+      <w:numFmt w:val="lowerLetter"/>
+      <w:lvlText w:val="%5."/>
+      <w:lvlJc w:val="left"/>
+      <w:pPr>
+        <w:ind w:left="3957" w:hanging="360"/>
+      </w:pPr>
+    </w:lvl>
+    <w:lvl w:ilvl="5" w:tplc="0409001B" w:tentative="1">
+      <w:start w:val="1"/>
+      <w:numFmt w:val="lowerRoman"/>
+      <w:lvlText w:val="%6."/>
+      <w:lvlJc w:val="right"/>
+      <w:pPr>
+        <w:ind w:left="4677" w:hanging="180"/>
+      </w:pPr>
+    </w:lvl>
+    <w:lvl w:ilvl="6" w:tplc="0409000F" w:tentative="1">
+      <w:start w:val="1"/>
+      <w:numFmt w:val="decimal"/>
+      <w:lvlText w:val="%7."/>
+      <w:lvlJc w:val="left"/>
+      <w:pPr>
+        <w:ind w:left="5397" w:hanging="360"/>
+      </w:pPr>
+    </w:lvl>
+    <w:lvl w:ilvl="7" w:tplc="04090019" w:tentative="1">
+      <w:start w:val="1"/>
+      <w:numFmt w:val="lowerLetter"/>
+      <w:lvlText w:val="%8."/>
+      <w:lvlJc w:val="left"/>
+      <w:pPr>
+        <w:ind w:left="6117" w:hanging="360"/>
+      </w:pPr>
+    </w:lvl>
+    <w:lvl w:ilvl="8" w:tplc="0409001B" w:tentative="1">
+      <w:start w:val="1"/>
+      <w:numFmt w:val="lowerRoman"/>
+      <w:lvlText w:val="%9."/>
+      <w:lvlJc w:val="right"/>
+      <w:pPr>
+        <w:ind w:left="6837" w:hanging="180"/>
+      </w:pPr>
+    </w:lvl>
+  </w:abstractNum>
+  <w:abstractNum w:abstractNumId="1" w15:restartNumberingAfterBreak="0">
     <w:nsid w:val="20B15020"/>
     <w:multiLevelType w:val="hybridMultilevel"/>
     <w:tmpl w:val="DBD06BBC"/>
@@ -2206,7 +2814,7 @@
       </w:pPr>
     </w:lvl>
   </w:abstractNum>
-  <w:abstractNum w:abstractNumId="1" w15:restartNumberingAfterBreak="0">
+  <w:abstractNum w:abstractNumId="2" w15:restartNumberingAfterBreak="0">
     <w:nsid w:val="31C92D12"/>
     <w:multiLevelType w:val="hybridMultilevel"/>
     <w:tmpl w:val="6DAE1DB6"/>
@@ -2292,7 +2900,93 @@
       </w:pPr>
     </w:lvl>
   </w:abstractNum>
-  <w:abstractNum w:abstractNumId="2" w15:restartNumberingAfterBreak="0">
+  <w:abstractNum w:abstractNumId="3" w15:restartNumberingAfterBreak="0">
+    <w:nsid w:val="4AC94359"/>
+    <w:multiLevelType w:val="hybridMultilevel"/>
+    <w:tmpl w:val="0038C84C"/>
+    <w:lvl w:ilvl="0" w:tplc="0409000F">
+      <w:start w:val="1"/>
+      <w:numFmt w:val="decimal"/>
+      <w:lvlText w:val="%1."/>
+      <w:lvlJc w:val="left"/>
+      <w:pPr>
+        <w:ind w:left="720" w:hanging="360"/>
+      </w:pPr>
+    </w:lvl>
+    <w:lvl w:ilvl="1" w:tplc="04090019" w:tentative="1">
+      <w:start w:val="1"/>
+      <w:numFmt w:val="lowerLetter"/>
+      <w:lvlText w:val="%2."/>
+      <w:lvlJc w:val="left"/>
+      <w:pPr>
+        <w:ind w:left="1440" w:hanging="360"/>
+      </w:pPr>
+    </w:lvl>
+    <w:lvl w:ilvl="2" w:tplc="0409001B" w:tentative="1">
+      <w:start w:val="1"/>
+      <w:numFmt w:val="lowerRoman"/>
+      <w:lvlText w:val="%3."/>
+      <w:lvlJc w:val="right"/>
+      <w:pPr>
+        <w:ind w:left="2160" w:hanging="180"/>
+      </w:pPr>
+    </w:lvl>
+    <w:lvl w:ilvl="3" w:tplc="0409000F" w:tentative="1">
+      <w:start w:val="1"/>
+      <w:numFmt w:val="decimal"/>
+      <w:lvlText w:val="%4."/>
+      <w:lvlJc w:val="left"/>
+      <w:pPr>
+        <w:ind w:left="2880" w:hanging="360"/>
+      </w:pPr>
+    </w:lvl>
+    <w:lvl w:ilvl="4" w:tplc="04090019" w:tentative="1">
+      <w:start w:val="1"/>
+      <w:numFmt w:val="lowerLetter"/>
+      <w:lvlText w:val="%5."/>
+      <w:lvlJc w:val="left"/>
+      <w:pPr>
+        <w:ind w:left="3600" w:hanging="360"/>
+      </w:pPr>
+    </w:lvl>
+    <w:lvl w:ilvl="5" w:tplc="0409001B" w:tentative="1">
+      <w:start w:val="1"/>
+      <w:numFmt w:val="lowerRoman"/>
+      <w:lvlText w:val="%6."/>
+      <w:lvlJc w:val="right"/>
+      <w:pPr>
+        <w:ind w:left="4320" w:hanging="180"/>
+      </w:pPr>
+    </w:lvl>
+    <w:lvl w:ilvl="6" w:tplc="0409000F" w:tentative="1">
+      <w:start w:val="1"/>
+      <w:numFmt w:val="decimal"/>
+      <w:lvlText w:val="%7."/>
+      <w:lvlJc w:val="left"/>
+      <w:pPr>
+        <w:ind w:left="5040" w:hanging="360"/>
+      </w:pPr>
+    </w:lvl>
+    <w:lvl w:ilvl="7" w:tplc="04090019" w:tentative="1">
+      <w:start w:val="1"/>
+      <w:numFmt w:val="lowerLetter"/>
+      <w:lvlText w:val="%8."/>
+      <w:lvlJc w:val="left"/>
+      <w:pPr>
+        <w:ind w:left="5760" w:hanging="360"/>
+      </w:pPr>
+    </w:lvl>
+    <w:lvl w:ilvl="8" w:tplc="0409001B" w:tentative="1">
+      <w:start w:val="1"/>
+      <w:numFmt w:val="lowerRoman"/>
+      <w:lvlText w:val="%9."/>
+      <w:lvlJc w:val="right"/>
+      <w:pPr>
+        <w:ind w:left="6480" w:hanging="180"/>
+      </w:pPr>
+    </w:lvl>
+  </w:abstractNum>
+  <w:abstractNum w:abstractNumId="4" w15:restartNumberingAfterBreak="0">
     <w:nsid w:val="76F13A7C"/>
     <w:multiLevelType w:val="hybridMultilevel"/>
     <w:tmpl w:val="2D625A76"/>
@@ -2379,13 +3073,19 @@
     </w:lvl>
   </w:abstractNum>
   <w:num w:numId="1" w16cid:durableId="1480999334">
+    <w:abstractNumId w:val="2"/>
+  </w:num>
+  <w:num w:numId="2" w16cid:durableId="2092728128">
     <w:abstractNumId w:val="1"/>
   </w:num>
-  <w:num w:numId="2" w16cid:durableId="2092728128">
+  <w:num w:numId="3" w16cid:durableId="1872373336">
+    <w:abstractNumId w:val="4"/>
+  </w:num>
+  <w:num w:numId="4" w16cid:durableId="1458063745">
     <w:abstractNumId w:val="0"/>
   </w:num>
-  <w:num w:numId="3" w16cid:durableId="1872373336">
-    <w:abstractNumId w:val="2"/>
+  <w:num w:numId="5" w16cid:durableId="1630086414">
+    <w:abstractNumId w:val="3"/>
   </w:num>
 </w:numbering>
 </file>

</xml_diff>

<commit_message>
Update Assignment 2 Screenshots.pdf and other recent changes
</commit_message>
<xml_diff>
--- a/screenshots/Assignment 2 Screenshots.docx
+++ b/screenshots/Assignment 2 Screenshots.docx
@@ -107,6 +107,70 @@
         </w:rPr>
         <w:t>Agentic AI – 04</w:t>
       </w:r>
+    </w:p>
+    <w:p>
+      <w:pPr>
+        <w:rPr>
+          <w:sz w:val="32"/>
+          <w:szCs w:val="32"/>
+        </w:rPr>
+      </w:pPr>
+      <w:proofErr w:type="spellStart"/>
+      <w:r>
+        <w:rPr>
+          <w:b/>
+          <w:bCs/>
+          <w:sz w:val="32"/>
+          <w:szCs w:val="32"/>
+        </w:rPr>
+        <w:t>Github</w:t>
+      </w:r>
+      <w:proofErr w:type="spellEnd"/>
+      <w:r>
+        <w:rPr>
+          <w:b/>
+          <w:bCs/>
+          <w:sz w:val="32"/>
+          <w:szCs w:val="32"/>
+        </w:rPr>
+        <w:t xml:space="preserve"> repo link: </w:t>
+      </w:r>
+      <w:hyperlink r:id="rId7" w:history="1">
+        <w:r>
+          <w:rPr>
+            <w:rStyle w:val="Hyperlink"/>
+            <w:sz w:val="32"/>
+            <w:szCs w:val="32"/>
+          </w:rPr>
+          <w:t>Pranav-Suresh1024/</w:t>
+        </w:r>
+        <w:proofErr w:type="spellStart"/>
+        <w:r>
+          <w:rPr>
+            <w:rStyle w:val="Hyperlink"/>
+            <w:sz w:val="32"/>
+            <w:szCs w:val="32"/>
+          </w:rPr>
+          <w:t>c</w:t>
+        </w:r>
+        <w:r>
+          <w:rPr>
+            <w:rStyle w:val="Hyperlink"/>
+            <w:sz w:val="32"/>
+            <w:szCs w:val="32"/>
+          </w:rPr>
+          <w:t>u</w:t>
+        </w:r>
+        <w:r>
+          <w:rPr>
+            <w:rStyle w:val="Hyperlink"/>
+            <w:sz w:val="32"/>
+            <w:szCs w:val="32"/>
+          </w:rPr>
+          <w:t>stomer_support_bot</w:t>
+        </w:r>
+        <w:proofErr w:type="spellEnd"/>
+      </w:hyperlink>
     </w:p>
     <w:p>
       <w:pPr>
@@ -169,7 +233,7 @@
                     <pic:cNvPicPr/>
                   </pic:nvPicPr>
                   <pic:blipFill rotWithShape="1">
-                    <a:blip r:embed="rId7"/>
+                    <a:blip r:embed="rId8"/>
                     <a:srcRect b="19974"/>
                     <a:stretch>
                       <a:fillRect/>
@@ -230,7 +294,7 @@
                     <pic:cNvPicPr/>
                   </pic:nvPicPr>
                   <pic:blipFill rotWithShape="1">
-                    <a:blip r:embed="rId8"/>
+                    <a:blip r:embed="rId9"/>
                     <a:srcRect r="-229" b="21247"/>
                     <a:stretch>
                       <a:fillRect/>
@@ -291,7 +355,7 @@
                     <pic:cNvPicPr/>
                   </pic:nvPicPr>
                   <pic:blipFill rotWithShape="1">
-                    <a:blip r:embed="rId9"/>
+                    <a:blip r:embed="rId10"/>
                     <a:srcRect r="-60" b="21857"/>
                     <a:stretch>
                       <a:fillRect/>
@@ -352,7 +416,7 @@
                     <pic:cNvPicPr/>
                   </pic:nvPicPr>
                   <pic:blipFill>
-                    <a:blip r:embed="rId10"/>
+                    <a:blip r:embed="rId11"/>
                     <a:stretch>
                       <a:fillRect/>
                     </a:stretch>
@@ -404,7 +468,7 @@
                     <pic:cNvPicPr/>
                   </pic:nvPicPr>
                   <pic:blipFill>
-                    <a:blip r:embed="rId11"/>
+                    <a:blip r:embed="rId12"/>
                     <a:stretch>
                       <a:fillRect/>
                     </a:stretch>
@@ -514,7 +578,6 @@
           <w:sz w:val="32"/>
           <w:szCs w:val="32"/>
         </w:rPr>
-        <w:lastRenderedPageBreak/>
         <w:t>Routing</w:t>
       </w:r>
     </w:p>
@@ -549,7 +612,7 @@
                     <pic:cNvPicPr/>
                   </pic:nvPicPr>
                   <pic:blipFill>
-                    <a:blip r:embed="rId12"/>
+                    <a:blip r:embed="rId13"/>
                     <a:stretch>
                       <a:fillRect/>
                     </a:stretch>
@@ -601,7 +664,7 @@
                     <pic:cNvPicPr/>
                   </pic:nvPicPr>
                   <pic:blipFill>
-                    <a:blip r:embed="rId13"/>
+                    <a:blip r:embed="rId14"/>
                     <a:stretch>
                       <a:fillRect/>
                     </a:stretch>
@@ -653,7 +716,7 @@
                     <pic:cNvPicPr/>
                   </pic:nvPicPr>
                   <pic:blipFill>
-                    <a:blip r:embed="rId14"/>
+                    <a:blip r:embed="rId15"/>
                     <a:stretch>
                       <a:fillRect/>
                     </a:stretch>
@@ -705,7 +768,7 @@
                     <pic:cNvPicPr/>
                   </pic:nvPicPr>
                   <pic:blipFill>
-                    <a:blip r:embed="rId15"/>
+                    <a:blip r:embed="rId16"/>
                     <a:stretch>
                       <a:fillRect/>
                     </a:stretch>
@@ -757,7 +820,7 @@
                     <pic:cNvPicPr/>
                   </pic:nvPicPr>
                   <pic:blipFill>
-                    <a:blip r:embed="rId16"/>
+                    <a:blip r:embed="rId17"/>
                     <a:stretch>
                       <a:fillRect/>
                     </a:stretch>
@@ -831,7 +894,7 @@
                     <pic:cNvPicPr/>
                   </pic:nvPicPr>
                   <pic:blipFill>
-                    <a:blip r:embed="rId17"/>
+                    <a:blip r:embed="rId18"/>
                     <a:stretch>
                       <a:fillRect/>
                     </a:stretch>
@@ -884,7 +947,7 @@
                     <pic:cNvPicPr/>
                   </pic:nvPicPr>
                   <pic:blipFill>
-                    <a:blip r:embed="rId18"/>
+                    <a:blip r:embed="rId19"/>
                     <a:stretch>
                       <a:fillRect/>
                     </a:stretch>
@@ -958,7 +1021,7 @@
                     <pic:cNvPicPr/>
                   </pic:nvPicPr>
                   <pic:blipFill>
-                    <a:blip r:embed="rId19"/>
+                    <a:blip r:embed="rId20"/>
                     <a:stretch>
                       <a:fillRect/>
                     </a:stretch>
@@ -1010,7 +1073,7 @@
                     <pic:cNvPicPr/>
                   </pic:nvPicPr>
                   <pic:blipFill>
-                    <a:blip r:embed="rId20"/>
+                    <a:blip r:embed="rId21"/>
                     <a:stretch>
                       <a:fillRect/>
                     </a:stretch>
@@ -1084,7 +1147,7 @@
                     <pic:cNvPicPr/>
                   </pic:nvPicPr>
                   <pic:blipFill>
-                    <a:blip r:embed="rId21"/>
+                    <a:blip r:embed="rId22"/>
                     <a:stretch>
                       <a:fillRect/>
                     </a:stretch>
@@ -1137,7 +1200,7 @@
                     <pic:cNvPicPr/>
                   </pic:nvPicPr>
                   <pic:blipFill>
-                    <a:blip r:embed="rId22"/>
+                    <a:blip r:embed="rId23"/>
                     <a:stretch>
                       <a:fillRect/>
                     </a:stretch>
@@ -1211,7 +1274,7 @@
                     <pic:cNvPicPr/>
                   </pic:nvPicPr>
                   <pic:blipFill>
-                    <a:blip r:embed="rId23"/>
+                    <a:blip r:embed="rId24"/>
                     <a:stretch>
                       <a:fillRect/>
                     </a:stretch>
@@ -1263,7 +1326,7 @@
                     <pic:cNvPicPr/>
                   </pic:nvPicPr>
                   <pic:blipFill>
-                    <a:blip r:embed="rId24"/>
+                    <a:blip r:embed="rId25"/>
                     <a:stretch>
                       <a:fillRect/>
                     </a:stretch>
@@ -1337,7 +1400,7 @@
                     <pic:cNvPicPr/>
                   </pic:nvPicPr>
                   <pic:blipFill>
-                    <a:blip r:embed="rId25"/>
+                    <a:blip r:embed="rId26"/>
                     <a:stretch>
                       <a:fillRect/>
                     </a:stretch>
@@ -1390,7 +1453,7 @@
                     <pic:cNvPicPr/>
                   </pic:nvPicPr>
                   <pic:blipFill>
-                    <a:blip r:embed="rId26"/>
+                    <a:blip r:embed="rId27"/>
                     <a:stretch>
                       <a:fillRect/>
                     </a:stretch>
@@ -1442,7 +1505,7 @@
                     <pic:cNvPicPr/>
                   </pic:nvPicPr>
                   <pic:blipFill>
-                    <a:blip r:embed="rId27"/>
+                    <a:blip r:embed="rId28"/>
                     <a:stretch>
                       <a:fillRect/>
                     </a:stretch>
@@ -1494,7 +1557,7 @@
                     <pic:cNvPicPr/>
                   </pic:nvPicPr>
                   <pic:blipFill>
-                    <a:blip r:embed="rId28"/>
+                    <a:blip r:embed="rId29"/>
                     <a:stretch>
                       <a:fillRect/>
                     </a:stretch>
@@ -1568,7 +1631,7 @@
                     <pic:cNvPicPr/>
                   </pic:nvPicPr>
                   <pic:blipFill>
-                    <a:blip r:embed="rId29"/>
+                    <a:blip r:embed="rId30"/>
                     <a:stretch>
                       <a:fillRect/>
                     </a:stretch>
@@ -1703,7 +1766,7 @@
                     <pic:cNvPicPr/>
                   </pic:nvPicPr>
                   <pic:blipFill>
-                    <a:blip r:embed="rId30"/>
+                    <a:blip r:embed="rId31"/>
                     <a:stretch>
                       <a:fillRect/>
                     </a:stretch>
@@ -1755,7 +1818,7 @@
                     <pic:cNvPicPr/>
                   </pic:nvPicPr>
                   <pic:blipFill>
-                    <a:blip r:embed="rId31"/>
+                    <a:blip r:embed="rId32"/>
                     <a:stretch>
                       <a:fillRect/>
                     </a:stretch>
@@ -1829,7 +1892,7 @@
                     <pic:cNvPicPr/>
                   </pic:nvPicPr>
                   <pic:blipFill>
-                    <a:blip r:embed="rId32"/>
+                    <a:blip r:embed="rId33"/>
                     <a:stretch>
                       <a:fillRect/>
                     </a:stretch>
@@ -1881,7 +1944,7 @@
                     <pic:cNvPicPr/>
                   </pic:nvPicPr>
                   <pic:blipFill>
-                    <a:blip r:embed="rId33"/>
+                    <a:blip r:embed="rId34"/>
                     <a:stretch>
                       <a:fillRect/>
                     </a:stretch>
@@ -1933,7 +1996,7 @@
                     <pic:cNvPicPr/>
                   </pic:nvPicPr>
                   <pic:blipFill>
-                    <a:blip r:embed="rId34"/>
+                    <a:blip r:embed="rId35"/>
                     <a:stretch>
                       <a:fillRect/>
                     </a:stretch>
@@ -1985,7 +2048,7 @@
                     <pic:cNvPicPr/>
                   </pic:nvPicPr>
                   <pic:blipFill>
-                    <a:blip r:embed="rId35"/>
+                    <a:blip r:embed="rId36"/>
                     <a:stretch>
                       <a:fillRect/>
                     </a:stretch>
@@ -2080,7 +2143,7 @@
                     <pic:cNvPicPr/>
                   </pic:nvPicPr>
                   <pic:blipFill>
-                    <a:blip r:embed="rId36"/>
+                    <a:blip r:embed="rId37"/>
                     <a:stretch>
                       <a:fillRect/>
                     </a:stretch>
@@ -2154,7 +2217,7 @@
                     <pic:cNvPicPr/>
                   </pic:nvPicPr>
                   <pic:blipFill>
-                    <a:blip r:embed="rId37"/>
+                    <a:blip r:embed="rId38"/>
                     <a:stretch>
                       <a:fillRect/>
                     </a:stretch>
@@ -2208,6 +2271,7 @@
       </w:pPr>
       <w:r>
         <w:rPr>
+          <w:noProof/>
           <w:sz w:val="32"/>
           <w:szCs w:val="32"/>
         </w:rPr>
@@ -2227,7 +2291,7 @@
                     <pic:cNvPicPr/>
                   </pic:nvPicPr>
                   <pic:blipFill>
-                    <a:blip r:embed="rId38"/>
+                    <a:blip r:embed="rId39"/>
                     <a:stretch>
                       <a:fillRect/>
                     </a:stretch>
@@ -2259,6 +2323,7 @@
       </w:pPr>
       <w:r>
         <w:rPr>
+          <w:noProof/>
           <w:sz w:val="32"/>
           <w:szCs w:val="32"/>
         </w:rPr>
@@ -2278,7 +2343,7 @@
                     <pic:cNvPicPr/>
                   </pic:nvPicPr>
                   <pic:blipFill>
-                    <a:blip r:embed="rId39"/>
+                    <a:blip r:embed="rId40"/>
                     <a:stretch>
                       <a:fillRect/>
                     </a:stretch>
@@ -2310,6 +2375,7 @@
       </w:pPr>
       <w:r>
         <w:rPr>
+          <w:noProof/>
           <w:sz w:val="32"/>
           <w:szCs w:val="32"/>
         </w:rPr>
@@ -2330,7 +2396,7 @@
                     <pic:cNvPicPr/>
                   </pic:nvPicPr>
                   <pic:blipFill>
-                    <a:blip r:embed="rId40"/>
+                    <a:blip r:embed="rId41"/>
                     <a:stretch>
                       <a:fillRect/>
                     </a:stretch>
@@ -2362,6 +2428,7 @@
       </w:pPr>
       <w:r>
         <w:rPr>
+          <w:noProof/>
           <w:sz w:val="32"/>
           <w:szCs w:val="32"/>
         </w:rPr>
@@ -2381,7 +2448,7 @@
                     <pic:cNvPicPr/>
                   </pic:nvPicPr>
                   <pic:blipFill>
-                    <a:blip r:embed="rId41"/>
+                    <a:blip r:embed="rId42"/>
                     <a:stretch>
                       <a:fillRect/>
                     </a:stretch>
@@ -2413,6 +2480,7 @@
       </w:pPr>
       <w:r>
         <w:rPr>
+          <w:noProof/>
           <w:sz w:val="32"/>
           <w:szCs w:val="32"/>
         </w:rPr>
@@ -2433,7 +2501,7 @@
                     <pic:cNvPicPr/>
                   </pic:nvPicPr>
                   <pic:blipFill>
-                    <a:blip r:embed="rId42"/>
+                    <a:blip r:embed="rId43"/>
                     <a:stretch>
                       <a:fillRect/>
                     </a:stretch>
@@ -2465,6 +2533,7 @@
       </w:pPr>
       <w:r>
         <w:rPr>
+          <w:noProof/>
           <w:sz w:val="32"/>
           <w:szCs w:val="32"/>
         </w:rPr>
@@ -2484,7 +2553,7 @@
                     <pic:cNvPicPr/>
                   </pic:nvPicPr>
                   <pic:blipFill>
-                    <a:blip r:embed="rId43"/>
+                    <a:blip r:embed="rId44"/>
                     <a:stretch>
                       <a:fillRect/>
                     </a:stretch>
@@ -2516,6 +2585,7 @@
       </w:pPr>
       <w:r>
         <w:rPr>
+          <w:noProof/>
           <w:sz w:val="32"/>
           <w:szCs w:val="32"/>
         </w:rPr>
@@ -2536,7 +2606,7 @@
                     <pic:cNvPicPr/>
                   </pic:nvPicPr>
                   <pic:blipFill>
-                    <a:blip r:embed="rId44"/>
+                    <a:blip r:embed="rId45"/>
                     <a:stretch>
                       <a:fillRect/>
                     </a:stretch>
@@ -2568,6 +2638,7 @@
       </w:pPr>
       <w:r>
         <w:rPr>
+          <w:noProof/>
           <w:sz w:val="32"/>
           <w:szCs w:val="32"/>
         </w:rPr>
@@ -2587,7 +2658,7 @@
                     <pic:cNvPicPr/>
                   </pic:nvPicPr>
                   <pic:blipFill>
-                    <a:blip r:embed="rId45"/>
+                    <a:blip r:embed="rId46"/>
                     <a:stretch>
                       <a:fillRect/>
                     </a:stretch>
@@ -3693,7 +3764,6 @@
   <w:style w:type="character" w:default="1" w:styleId="DefaultParagraphFont">
     <w:name w:val="Default Paragraph Font"/>
     <w:uiPriority w:val="1"/>
-    <w:semiHidden/>
     <w:unhideWhenUsed/>
   </w:style>
   <w:style w:type="table" w:default="1" w:styleId="TableNormal">
@@ -4030,6 +4100,18 @@
       <w:shd w:val="clear" w:color="auto" w:fill="E1DFDD"/>
     </w:rPr>
   </w:style>
+  <w:style w:type="character" w:styleId="FollowedHyperlink">
+    <w:name w:val="FollowedHyperlink"/>
+    <w:basedOn w:val="DefaultParagraphFont"/>
+    <w:uiPriority w:val="99"/>
+    <w:semiHidden/>
+    <w:unhideWhenUsed/>
+    <w:rsid w:val="00AD646D"/>
+    <w:rPr>
+      <w:color w:val="96607D" w:themeColor="followedHyperlink"/>
+      <w:u w:val="single"/>
+    </w:rPr>
+  </w:style>
 </w:styles>
 </file>
 

</xml_diff>